<commit_message>
Call core.py the agent runtime, and name the in-process compromise
core.py is the core of every agent, not of the platform. The Session 01 page
and guide 01 now say the platform hosts the runtime from Session 08 and a
supervisor built on the same loop coordinates agents from Session 06. Both,
and guide 08's concept script and verification scope, state that production
platforms run agents in separate processes or sandboxes, apart from the
control plane, and that the course runs them in the platform process as a
teaching compromise. Guides regenerated; check.py passes.

Co-Authored-By: Claude Opus 5.5 <noreply@anthropic.com>
Claude-Session: https://claude.ai/code/session_0123W63ZaDAAnYHCFqarTnbL
</commit_message>
<xml_diff>
--- a/L3 2026 Agentic Platform Instructor Materials/instructor-guides/08 Platform core agent registry and console.docx
+++ b/L3 2026 Agentic Platform Instructor Materials/instructor-guides/08 Platform core agent registry and console.docx
@@ -1755,7 +1755,7 @@
         <w:t xml:space="preserve">SAY </w:t>
       </w:r>
       <w:r>
-        <w:t>Draw three boxes. The registry is the platform's catalogue: which agents exist, who owns them, which tools and skills they declare, and which version is active or retired. The run service takes an authenticated request, resolves a definition, snapshots it into the run and hands the work to a worker that holds a lease. The console is a client of the same API with no privileged back door, so it sees exactly what the signed-in identity may see. Keep two scopes apart: the registry is platform-wide, while runs, approvals and evidence are tenant-scoped. Then name the trust boundaries: definitions are reviewed input, model answers and tool evidence are untrusted text, and a remote agent is trusted only as far as the card we pinned.</w:t>
+        <w:t>Draw three boxes. The registry is the platform's catalogue: which agents exist, who owns them, which tools and skills they declare, and which version is active or retired. The run service takes an authenticated request, resolves a definition, snapshots it into the run and hands the work to a worker that holds a lease. The console is a client of the same API with no privileged back door, so it sees exactly what the signed-in identity may see. Keep two scopes apart: the registry is platform-wide, while runs, approvals and evidence are tenant-scoped. Then name the trust boundaries: definitions are reviewed input, model answers and tool evidence are untrusted text, and a remote agent is trusted only as far as the card we pinned. Be explicit about one teaching compromise. Our workers run each agent inside the platform's own process, next to the API, the database connection and the credential store. In production the control plane and agent execution are separate: agents run in their own worker processes or sandboxed containers, often one per run, so a misbehaving or compromised agent cannot reach the platform's memory, data or secrets, and the runtime is a library those workers share. We keep them together so the whole platform runs on a laptop with one command; the A2A specialist from Session 07 already shows the out-of-process shape, with its own identity and its own token.</w:t>
       </w:r>
     </w:p>
     <w:p>
@@ -3088,6 +3088,11 @@
       </w:r>
     </w:p>
     <w:p>
+      <w:r>
+        <w:t>Agents run inside the platform process as a teaching compromise. Process or container isolation between the control plane and agent execution was not built or tested.</w:t>
+      </w:r>
+    </w:p>
+    <w:p>
       <w:pPr>
         <w:pStyle w:val="Heading1"/>
       </w:pPr>

</xml_diff>